<commit_message>
Add Experiment 2 files (docx and pdf)
</commit_message>
<xml_diff>
--- a/Experiment-02-TestDisk/Exp_2.docx
+++ b/Experiment-02-TestDisk/Exp_2.docx
@@ -530,9 +530,9 @@
           <w:noProof/>
         </w:rPr>
         <w:drawing>
-          <wp:inline distT="0" distB="0" distL="0" distR="0" wp14:anchorId="34030249" wp14:editId="76368ECD">
-            <wp:extent cx="5452745" cy="3556000"/>
-            <wp:effectExtent l="0" t="0" r="0" b="0"/>
+          <wp:inline distT="0" distB="0" distL="0" distR="0" wp14:anchorId="34030249" wp14:editId="4FA5579C">
+            <wp:extent cx="5452745" cy="3404925"/>
+            <wp:effectExtent l="0" t="0" r="0" b="5080"/>
             <wp:docPr id="1874396403" name="Picture 1"/>
             <wp:cNvGraphicFramePr>
               <a:graphicFrameLocks xmlns:a="http://schemas.openxmlformats.org/drawingml/2006/main" noChangeAspect="1"/>
@@ -546,7 +546,7 @@
                       <a:picLocks noChangeAspect="1" noChangeArrowheads="1"/>
                     </pic:cNvPicPr>
                   </pic:nvPicPr>
-                  <pic:blipFill>
+                  <pic:blipFill rotWithShape="1">
                     <a:blip r:embed="rId5">
                       <a:extLst>
                         <a:ext uri="{28A0092B-C50C-407E-A947-70E740481C1C}">
@@ -554,7 +554,7 @@
                         </a:ext>
                       </a:extLst>
                     </a:blip>
-                    <a:srcRect/>
+                    <a:srcRect t="4248"/>
                     <a:stretch>
                       <a:fillRect/>
                     </a:stretch>
@@ -562,7 +562,7 @@
                   <pic:spPr bwMode="auto">
                     <a:xfrm>
                       <a:off x="0" y="0"/>
-                      <a:ext cx="5452745" cy="3556000"/>
+                      <a:ext cx="5452745" cy="3404925"/>
                     </a:xfrm>
                     <a:prstGeom prst="rect">
                       <a:avLst/>
@@ -571,6 +571,11 @@
                     <a:ln>
                       <a:noFill/>
                     </a:ln>
+                    <a:extLst>
+                      <a:ext uri="{53640926-AAD7-44D8-BBD7-CCE9431645EC}">
+                        <a14:shadowObscured xmlns:a14="http://schemas.microsoft.com/office/drawing/2010/main"/>
+                      </a:ext>
+                    </a:extLst>
                   </pic:spPr>
                 </pic:pic>
               </a:graphicData>
@@ -666,9 +671,9 @@
         </w:rPr>
         <w:lastRenderedPageBreak/>
         <w:drawing>
-          <wp:inline distT="0" distB="0" distL="0" distR="0" wp14:anchorId="74A671F4" wp14:editId="54383D3E">
-            <wp:extent cx="5730774" cy="3606800"/>
-            <wp:effectExtent l="0" t="0" r="3810" b="0"/>
+          <wp:inline distT="0" distB="0" distL="0" distR="0" wp14:anchorId="74A671F4" wp14:editId="68DC9F93">
+            <wp:extent cx="5730240" cy="3447437"/>
+            <wp:effectExtent l="0" t="0" r="3810" b="635"/>
             <wp:docPr id="1909837048" name="Picture 2"/>
             <wp:cNvGraphicFramePr>
               <a:graphicFrameLocks xmlns:a="http://schemas.openxmlformats.org/drawingml/2006/main" noChangeAspect="1"/>
@@ -682,7 +687,7 @@
                       <a:picLocks noChangeAspect="1" noChangeArrowheads="1"/>
                     </pic:cNvPicPr>
                   </pic:nvPicPr>
-                  <pic:blipFill>
+                  <pic:blipFill rotWithShape="1">
                     <a:blip r:embed="rId6">
                       <a:extLst>
                         <a:ext uri="{28A0092B-C50C-407E-A947-70E740481C1C}">
@@ -690,7 +695,7 @@
                         </a:ext>
                       </a:extLst>
                     </a:blip>
-                    <a:srcRect/>
+                    <a:srcRect t="4409"/>
                     <a:stretch>
                       <a:fillRect/>
                     </a:stretch>
@@ -698,7 +703,7 @@
                   <pic:spPr bwMode="auto">
                     <a:xfrm>
                       <a:off x="0" y="0"/>
-                      <a:ext cx="5760414" cy="3625454"/>
+                      <a:ext cx="5760414" cy="3465590"/>
                     </a:xfrm>
                     <a:prstGeom prst="rect">
                       <a:avLst/>
@@ -707,6 +712,11 @@
                     <a:ln>
                       <a:noFill/>
                     </a:ln>
+                    <a:extLst>
+                      <a:ext uri="{53640926-AAD7-44D8-BBD7-CCE9431645EC}">
+                        <a14:shadowObscured xmlns:a14="http://schemas.microsoft.com/office/drawing/2010/main"/>
+                      </a:ext>
+                    </a:extLst>
                   </pic:spPr>
                 </pic:pic>
               </a:graphicData>
@@ -825,9 +835,9 @@
           <w:noProof/>
         </w:rPr>
         <w:drawing>
-          <wp:inline distT="0" distB="0" distL="0" distR="0" wp14:anchorId="1C4BDB58" wp14:editId="24514408">
-            <wp:extent cx="5503091" cy="2870200"/>
-            <wp:effectExtent l="0" t="0" r="2540" b="6350"/>
+          <wp:inline distT="0" distB="0" distL="0" distR="0" wp14:anchorId="1C4BDB58" wp14:editId="30EBC1CE">
+            <wp:extent cx="5502910" cy="2711080"/>
+            <wp:effectExtent l="0" t="0" r="2540" b="0"/>
             <wp:docPr id="1302208760" name="Picture 3"/>
             <wp:cNvGraphicFramePr>
               <a:graphicFrameLocks xmlns:a="http://schemas.openxmlformats.org/drawingml/2006/main" noChangeAspect="1"/>
@@ -841,7 +851,7 @@
                       <a:picLocks noChangeAspect="1" noChangeArrowheads="1"/>
                     </pic:cNvPicPr>
                   </pic:nvPicPr>
-                  <pic:blipFill>
+                  <pic:blipFill rotWithShape="1">
                     <a:blip r:embed="rId7">
                       <a:extLst>
                         <a:ext uri="{28A0092B-C50C-407E-A947-70E740481C1C}">
@@ -849,7 +859,7 @@
                         </a:ext>
                       </a:extLst>
                     </a:blip>
-                    <a:srcRect/>
+                    <a:srcRect t="5541"/>
                     <a:stretch>
                       <a:fillRect/>
                     </a:stretch>
@@ -857,7 +867,7 @@
                   <pic:spPr bwMode="auto">
                     <a:xfrm>
                       <a:off x="0" y="0"/>
-                      <a:ext cx="5509698" cy="2873646"/>
+                      <a:ext cx="5509698" cy="2714424"/>
                     </a:xfrm>
                     <a:prstGeom prst="rect">
                       <a:avLst/>
@@ -866,6 +876,11 @@
                     <a:ln>
                       <a:noFill/>
                     </a:ln>
+                    <a:extLst>
+                      <a:ext uri="{53640926-AAD7-44D8-BBD7-CCE9431645EC}">
+                        <a14:shadowObscured xmlns:a14="http://schemas.microsoft.com/office/drawing/2010/main"/>
+                      </a:ext>
+                    </a:extLst>
                   </pic:spPr>
                 </pic:pic>
               </a:graphicData>
@@ -944,9 +959,9 @@
           <w:noProof/>
         </w:rPr>
         <w:drawing>
-          <wp:inline distT="0" distB="0" distL="0" distR="0" wp14:anchorId="20E76B06" wp14:editId="6A1DCEC8">
-            <wp:extent cx="5588000" cy="3843655"/>
-            <wp:effectExtent l="0" t="0" r="0" b="4445"/>
+          <wp:inline distT="0" distB="0" distL="0" distR="0" wp14:anchorId="20E76B06" wp14:editId="617D6A38">
+            <wp:extent cx="5588000" cy="3668726"/>
+            <wp:effectExtent l="0" t="0" r="0" b="8255"/>
             <wp:docPr id="1849606960" name="Picture 4"/>
             <wp:cNvGraphicFramePr>
               <a:graphicFrameLocks xmlns:a="http://schemas.openxmlformats.org/drawingml/2006/main" noChangeAspect="1"/>
@@ -960,7 +975,7 @@
                       <a:picLocks noChangeAspect="1" noChangeArrowheads="1"/>
                     </pic:cNvPicPr>
                   </pic:nvPicPr>
-                  <pic:blipFill>
+                  <pic:blipFill rotWithShape="1">
                     <a:blip r:embed="rId8">
                       <a:extLst>
                         <a:ext uri="{28A0092B-C50C-407E-A947-70E740481C1C}">
@@ -968,7 +983,7 @@
                         </a:ext>
                       </a:extLst>
                     </a:blip>
-                    <a:srcRect/>
+                    <a:srcRect t="4551"/>
                     <a:stretch>
                       <a:fillRect/>
                     </a:stretch>
@@ -976,7 +991,7 @@
                   <pic:spPr bwMode="auto">
                     <a:xfrm>
                       <a:off x="0" y="0"/>
-                      <a:ext cx="5588000" cy="3843655"/>
+                      <a:ext cx="5588000" cy="3668726"/>
                     </a:xfrm>
                     <a:prstGeom prst="rect">
                       <a:avLst/>
@@ -985,6 +1000,11 @@
                     <a:ln>
                       <a:noFill/>
                     </a:ln>
+                    <a:extLst>
+                      <a:ext uri="{53640926-AAD7-44D8-BBD7-CCE9431645EC}">
+                        <a14:shadowObscured xmlns:a14="http://schemas.microsoft.com/office/drawing/2010/main"/>
+                      </a:ext>
+                    </a:extLst>
                   </pic:spPr>
                 </pic:pic>
               </a:graphicData>
@@ -1056,9 +1076,9 @@
         </w:rPr>
         <w:lastRenderedPageBreak/>
         <w:drawing>
-          <wp:inline distT="0" distB="0" distL="0" distR="0" wp14:anchorId="3EB1F0EB" wp14:editId="26627AA6">
-            <wp:extent cx="5020945" cy="3028950"/>
-            <wp:effectExtent l="0" t="0" r="8255" b="0"/>
+          <wp:inline distT="0" distB="0" distL="0" distR="0" wp14:anchorId="3EB1F0EB" wp14:editId="1CE4CD67">
+            <wp:extent cx="5020945" cy="2949437"/>
+            <wp:effectExtent l="0" t="0" r="8255" b="3810"/>
             <wp:docPr id="1331642504" name="Picture 5"/>
             <wp:cNvGraphicFramePr>
               <a:graphicFrameLocks xmlns:a="http://schemas.openxmlformats.org/drawingml/2006/main" noChangeAspect="1"/>
@@ -1072,7 +1092,7 @@
                       <a:picLocks noChangeAspect="1" noChangeArrowheads="1"/>
                     </pic:cNvPicPr>
                   </pic:nvPicPr>
-                  <pic:blipFill>
+                  <pic:blipFill rotWithShape="1">
                     <a:blip r:embed="rId9">
                       <a:extLst>
                         <a:ext uri="{28A0092B-C50C-407E-A947-70E740481C1C}">
@@ -1080,7 +1100,7 @@
                         </a:ext>
                       </a:extLst>
                     </a:blip>
-                    <a:srcRect/>
+                    <a:srcRect t="2625"/>
                     <a:stretch>
                       <a:fillRect/>
                     </a:stretch>
@@ -1088,7 +1108,7 @@
                   <pic:spPr bwMode="auto">
                     <a:xfrm>
                       <a:off x="0" y="0"/>
-                      <a:ext cx="5020945" cy="3028950"/>
+                      <a:ext cx="5020945" cy="2949437"/>
                     </a:xfrm>
                     <a:prstGeom prst="rect">
                       <a:avLst/>
@@ -1097,6 +1117,11 @@
                     <a:ln>
                       <a:noFill/>
                     </a:ln>
+                    <a:extLst>
+                      <a:ext uri="{53640926-AAD7-44D8-BBD7-CCE9431645EC}">
+                        <a14:shadowObscured xmlns:a14="http://schemas.microsoft.com/office/drawing/2010/main"/>
+                      </a:ext>
+                    </a:extLst>
                   </pic:spPr>
                 </pic:pic>
               </a:graphicData>
@@ -1210,8 +1235,8 @@
           <w:noProof/>
         </w:rPr>
         <w:drawing>
-          <wp:inline distT="0" distB="0" distL="0" distR="0" wp14:anchorId="6D1D25AE" wp14:editId="7D357420">
-            <wp:extent cx="5731510" cy="3105150"/>
+          <wp:inline distT="0" distB="0" distL="0" distR="0" wp14:anchorId="6D1D25AE" wp14:editId="33C14034">
+            <wp:extent cx="5731510" cy="2977929"/>
             <wp:effectExtent l="0" t="0" r="2540" b="0"/>
             <wp:docPr id="1735079049" name="Picture 6"/>
             <wp:cNvGraphicFramePr>
@@ -1226,7 +1251,7 @@
                       <a:picLocks noChangeAspect="1" noChangeArrowheads="1"/>
                     </pic:cNvPicPr>
                   </pic:nvPicPr>
-                  <pic:blipFill>
+                  <pic:blipFill rotWithShape="1">
                     <a:blip r:embed="rId10">
                       <a:extLst>
                         <a:ext uri="{28A0092B-C50C-407E-A947-70E740481C1C}">
@@ -1234,7 +1259,7 @@
                         </a:ext>
                       </a:extLst>
                     </a:blip>
-                    <a:srcRect/>
+                    <a:srcRect t="4097"/>
                     <a:stretch>
                       <a:fillRect/>
                     </a:stretch>
@@ -1242,7 +1267,7 @@
                   <pic:spPr bwMode="auto">
                     <a:xfrm>
                       <a:off x="0" y="0"/>
-                      <a:ext cx="5731510" cy="3105150"/>
+                      <a:ext cx="5731510" cy="2977929"/>
                     </a:xfrm>
                     <a:prstGeom prst="rect">
                       <a:avLst/>
@@ -1251,6 +1276,11 @@
                     <a:ln>
                       <a:noFill/>
                     </a:ln>
+                    <a:extLst>
+                      <a:ext uri="{53640926-AAD7-44D8-BBD7-CCE9431645EC}">
+                        <a14:shadowObscured xmlns:a14="http://schemas.microsoft.com/office/drawing/2010/main"/>
+                      </a:ext>
+                    </a:extLst>
                   </pic:spPr>
                 </pic:pic>
               </a:graphicData>
@@ -1288,6 +1318,7 @@
         <w:rPr>
           <w:noProof/>
         </w:rPr>
+        <w:lastRenderedPageBreak/>
         <w:drawing>
           <wp:inline distT="0" distB="0" distL="0" distR="0" wp14:anchorId="73E97F2F" wp14:editId="60D785D4">
             <wp:extent cx="5498040" cy="3490622"/>
@@ -1422,7 +1453,6 @@
         <w:rPr>
           <w:noProof/>
         </w:rPr>
-        <w:lastRenderedPageBreak/>
         <w:drawing>
           <wp:inline distT="0" distB="0" distL="0" distR="0" wp14:anchorId="2E7EC69A" wp14:editId="642B3D78">
             <wp:extent cx="4149140" cy="3488266"/>
@@ -1486,6 +1516,7 @@
           <w:i/>
           <w:iCs/>
         </w:rPr>
+        <w:lastRenderedPageBreak/>
         <w:t>Figure 8: Highlighting the located FAT32 partition</w:t>
       </w:r>
     </w:p>
@@ -1580,7 +1611,6 @@
         <w:rPr>
           <w:noProof/>
         </w:rPr>
-        <w:lastRenderedPageBreak/>
         <w:drawing>
           <wp:inline distT="0" distB="0" distL="0" distR="0" wp14:anchorId="7E486068" wp14:editId="3331CB74">
             <wp:extent cx="5731510" cy="4249227"/>
@@ -1713,6 +1743,7 @@
         <w:rPr>
           <w:rFonts w:ascii="Times New Roman" w:hAnsi="Times New Roman" w:cs="Times New Roman"/>
         </w:rPr>
+        <w:lastRenderedPageBreak/>
         <w:t>Press c to copy the current selected file (or C to copy all selected files).</w:t>
       </w:r>
     </w:p>
@@ -1747,7 +1778,6 @@
         <w:rPr>
           <w:noProof/>
         </w:rPr>
-        <w:lastRenderedPageBreak/>
         <w:drawing>
           <wp:inline distT="0" distB="0" distL="0" distR="0" wp14:anchorId="7F3FB989" wp14:editId="73CA36A9">
             <wp:extent cx="5731167" cy="3403683"/>
@@ -1958,6 +1988,7 @@
         <w:rPr>
           <w:rFonts w:ascii="Times New Roman" w:hAnsi="Times New Roman" w:cs="Times New Roman"/>
         </w:rPr>
+        <w:lastRenderedPageBreak/>
         <w:t>Press q to quit the file listing and return to the partition selection.</w:t>
       </w:r>
     </w:p>
@@ -1996,7 +2027,6 @@
         <w:rPr>
           <w:rFonts w:ascii="Times New Roman" w:hAnsi="Times New Roman" w:cs="Times New Roman"/>
         </w:rPr>
-        <w:lastRenderedPageBreak/>
         <w:t>If all partitions are correctly listed, confirm at [Write] with Enter, press y to confirm, and then OK.</w:t>
       </w:r>
     </w:p>

</xml_diff>